<commit_message>
1Peter: full meaning audit 2026-09-23 — 26 fixes (EN 24, KO 1 + KO titles), gates 1-8 PASS, 0 split candidates
</commit_message>
<xml_diff>
--- a/gdocs_build/1Peter.docx
+++ b/gdocs_build/1Peter.docx
@@ -20,7 +20,7 @@
         <w:pStyle w:val="Heading1"/>
       </w:pPr>
       <w:r>
-        <w:t>Chapter 1 — You've Got an honored one Pass to a Crazy Awesome Future</w:t>
+        <w:t>Chapter 1 — You've Got an All-Access Pass to a Crazy Awesome Future</w:t>
       </w:r>
     </w:p>
     <w:tbl>
@@ -124,7 +124,7 @@
               <w:rPr>
                 <w:sz w:val="18"/>
               </w:rPr>
-              <w:t>Hey, what up! It's Peter, an apostle on assignment from Jesus the Messiah, dropping a line to all you guys who are scattered all over the place. You might feel like you're on the outside looking in, but God the Father's got his eye on every single one of you. He hasn't forgotten a single person. The Holy Spirit is working in you, keeping you obedient, all through the sacrifice Jesus made for us. I hope you're getting all the good stuff God has for you!</w:t>
+              <w:t>Hey, what up! It's Peter, an apostle on assignment from Jesus the Messiah, dropping a line to all you exiles scattered all over the place. You might feel like you're on the outside looking in, but God the Father's got his eye on every single one of you. He hasn't forgotten a single person. The Holy Spirit is working in you, keeping you obedient, all through the sacrifice Jesus made for us. I hope you're getting all the good stuff God has for you!</w:t>
             </w:r>
           </w:p>
         </w:tc>
@@ -329,7 +329,7 @@
               <w:rPr>
                 <w:sz w:val="18"/>
               </w:rPr>
-              <w:t>I know this makes you feel stoked, even when you're dealing with all sorts of annoying stuff. Think about it like this: when you put gold in the fire, it comes out pure. When your faith goes through tough times, it comes out legit. When Jesus comes back and wraps everything up, it's your faith, not your money, that God's gonna show off as proof of his win.</w:t>
+              <w:t>I know this makes you feel stoked, even when you're dealing with all sorts of annoying stuff. Think about it like this: when you put gold in the fire, it comes out proved pure. When your faith goes through tough times, it comes out proved legit. When Jesus comes back and wraps everything up, it's your faith, not your money, that God's gonna show off as proof of his win.</w:t>
             </w:r>
           </w:p>
         </w:tc>
@@ -1232,7 +1232,7 @@
               <w:rPr>
                 <w:sz w:val="18"/>
               </w:rPr>
-              <w:t>Check it out, you're now part of something epic. Think of Jesus as the 'living Stone,' the source of all life. Some haters, like a bunch of clumsy construction workers, took one look at him and said, 'Nah, this stone is trash,' and tossed it. But God, the master builder, picked up that same stone and made it the most important one of all—the cornerstone. Now, you guys are like living stones, too. God is using you to build a super cool, spiritual house. And you're the priests in this house, living lives that get a thumbs-up from Christ. The old scrolls even talked about this: 'Look! I'm putting a special stone in Zion, a cornerstone in the place of honor. Whoever trusts in this stone will never be sorry.' For you guys who trust him, this Stone is your pride and joy. But for the haters who ghosted him, that same stone they rejected is now the main event. For them, it's a stumbling block, a rock that trips them up. They stumble and fall because they refuse to obey, just as predicted.</w:t>
+              <w:t>Welcome to the living Stone, the source of all life — check it out, you're now part of something epic. Some haters, like a bunch of clumsy construction workers, took one look at him and said, 'Nah, this stone is trash,' and tossed it. But God, the master builder, picked up that same stone and made it the most important one of all—the cornerstone. Now, present yourselves like living stones, too, as building blocks for a super cool, spiritual house. And you're the priests in this house, living lives that get a thumbs-up from Christ. The old scrolls even talked about this: 'Look! I'm putting a special stone in Zion, a cornerstone in the place of honor. Whoever trusts in this stone will never be sorry.' For you guys who trust him, this Stone is your pride and joy. But for the haters who ghosted him, that same stone they rejected is now the chief foundation stone. For them, it's a stumbling block, a rock that trips them up, a boulder blocking the way. They stumble and fall because they refuse to obey, just as predicted.</w:t>
             </w:r>
           </w:p>
         </w:tc>
@@ -1374,7 +1374,7 @@
               <w:rPr>
                 <w:sz w:val="18"/>
               </w:rPr>
-              <w:t>This world isn't your permanent home, so don't get too comfortable. Don't let your ego run wild and mess up your soul. Live such good lives that when people see you, all their wrong ideas about you will be proven wrong. They'll be so impressed that they'll end up on God's side, ready to party when he shows up.</w:t>
+              <w:t>This world isn't your permanent home, so don't get too comfortable. Don't let your ego run wild and mess up your soul. Live such good lives in your neighborhood that when people see you, all their wrong ideas about you will be proven wrong. They'll be so impressed that they'll end up on God's side, ready to party when he shows up.</w:t>
             </w:r>
           </w:p>
         </w:tc>
@@ -1445,7 +1445,7 @@
               <w:rPr>
                 <w:sz w:val="18"/>
               </w:rPr>
-              <w:t>Be good citizens and make the Master proud. Respect the people in charge, from the president down to the local cops. They're God's crew for keeping things in order. God wants you to shut down the haters with your good actions. You're free — so use your freedom to serve God, not as an excuse to break the rules. Treat everyone with respect, love your Christian family, have a healthy fear of God, and respect the government.</w:t>
+              <w:t>Be good citizens and make the Master proud. Respect the people in charge, from the president down to the local cops. They're God's crew for keeping things in order. God wants you to shut down the haters with your good actions — curing the ignorance of the fools who think you're a danger to society. You're free — so use your freedom to serve God, not as an excuse to break the rules. Treat everyone with respect, love your Christian family, have a healthy fear of God, and respect the government.</w:t>
             </w:r>
           </w:p>
         </w:tc>
@@ -1650,7 +1650,7 @@
               <w:rPr>
                 <w:sz w:val="18"/>
               </w:rPr>
-              <w:t>This is the life you signed up for, the same kind of life Christ lived. He took all the hits that came his way to show you that it's possible, and to give you a step-by-step guide on how to do it. He never did anything wrong, and he never said a single bad word. People called him all sorts of names, but he never talked back. He suffered quietly and trusted God to make things right. He used his servant body to carry our sins to the cross so we could be done with sin and start living the right way. His wounds are what healed you. You were like lost sheep, with no clue who you were or where you were going. But now, you're named and kept for good by the Shepherd of your souls.</w:t>
+              <w:t>This is the kind of life you've been invited into, the same kind of life Christ lived. He took all the hits that came his way to show you that it's possible, and to give you a step-by-step guide on how to do it. He never did anything wrong, and he never said a single bad word. People called him all sorts of names, but he never talked back. He suffered quietly and trusted God to make things right. He used his servant body to carry our sins to the cross so we could be done with sin and start living the right way. His wounds are what healed you. You were like lost sheep, with no clue who you were or where you were going. But now, you're named and kept for good by the Shepherd of your souls.</w:t>
             </w:r>
           </w:p>
         </w:tc>
@@ -1874,7 +1874,7 @@
               <w:rPr>
                 <w:sz w:val="18"/>
               </w:rPr>
-              <w:t>아내 된 너희도 마찬가지야. 남편에게 좋은 아내가 돼. 남편의 필요에 반응해줘. 하나님 얘기에는 관심도 없는 남편도 너희의 거룩하고 아름다운 삶을 보고 마음이 움직일 거야. 중요한 건 겉모습이 아니야 — 머리 스타일, 장신구, 옷 맵시가 아니라 너희의 내면 성품이야.</w:t>
+              <w:t>아내 된 너희도 마찬가지야. 남편에게 좋은 아내가 돼. 남편의 필요에 반응해줘. 하나님 얘기에는 관심도 없는 남편도 너희의 거룩하고 아름다운 삶을 보고 마음이 움직일 거야. 중요한 건 겉모습이 아니야 — 머리 스타일, 장신구, 옷 맵시가 아니라 너희의 내면 성품이야. 그게 진짜 변화야.</w:t>
             </w:r>
           </w:p>
         </w:tc>
@@ -1922,7 +1922,7 @@
               <w:rPr>
                 <w:sz w:val="18"/>
               </w:rPr>
-              <w:t>Work on that inner beauty, the kind that's gentle and gracious, the stuff God is really into. The holy women back in the day were beautiful to God because they were loyal and good to their husbands. Take Sarah, for example. She took care of Abraham and respected him so much she called him "my dear husband." You'll be just like her if you do the same, no stress, no drama.</w:t>
+              <w:t>Work on that inner beauty, the kind that's gentle and gracious, the stuff God is really into. The holy women back in the day were beautiful to God because they were loyal and good to their husbands. Take Sarah, for example. She took care of Abraham and respected him so much she called him "my dear husband." You'll be true daughters of Sarah if you do the same, no stress, no drama.</w:t>
             </w:r>
           </w:p>
         </w:tc>
@@ -2269,7 +2269,7 @@
               <w:rPr>
                 <w:sz w:val="18"/>
               </w:rPr>
-              <w:t>If you're all in for doing good, who's going to stop you? And even if you get roasted for it, you're still winning. Don't even give the haters a second thought. Through thick and thin, stay focused on Christ, your ultimate boss. Be ready to tell anyone who asks why you live the way you do, but always be super polite about it. Keep your conscience clean before God, so when people try to throw shade at you, it won't even stick. They'll just end up looking like the fools who need to clean up their act. It's way better to suffer for doing good, if that's what God wants, than to get wrecked for doing bad. That's what Christ did. He took the hit for our sins, the perfect one for all of us who are messed up. He went through it all—he was put to death in the body but brought back to life by the Spirit—to bring us to God.</w:t>
+              <w:t>If you're all in for doing good, who's going to stop you? And even if you get roasted for it, you're still winning. Don't even give the haters a second thought. Through thick and thin, stay focused on Christ, your ultimate boss. Be ready to tell anyone who asks why you live the way you do, but always be super polite about it. Keep your conscience clean before God, so when people try to throw shade at you, it won't even stick. They'll just end up looking like the fools who need to clean up their act. It's way better to suffer for doing good, if that's what God wants, than to get wrecked for doing bad. That's what Christ did. He took the hit for our sins, the perfect one for all of us who are messed up. He went through it all—he was put to death and then made alive—to bring us to God.</w:t>
             </w:r>
           </w:p>
         </w:tc>
@@ -2683,7 +2683,7 @@
               <w:rPr>
                 <w:sz w:val="18"/>
               </w:rPr>
-              <w:t>Listen up. The good news was even told to people who are dead now. And even though they died, they still get to have the awesome life God gives through Jesus.</w:t>
+              <w:t>Listen to the Message. The good news was preached to those believers who are dead now. And even though they died (just like everyone does), they still get to have the awesome life God gives through Jesus.</w:t>
             </w:r>
           </w:p>
         </w:tc>
@@ -2754,7 +2754,7 @@
               <w:rPr>
                 <w:sz w:val="18"/>
               </w:rPr>
-              <w:t>The world is about to have its season finale, so don't take anything for granted. Stay alert and pray. Most importantly, love each other like your life depends on it. Love pretty much fixes everything. If someone's hungry, get them a burger. If they need a place to crash, let them crash at your place. And do it with a smile. God gave you all sorts of cool stuff, so share it! If you're good with words, use them to say what God would say. If you're good at helping, then help with all your heart. That way, everyone will see how awesome God is, and Jesus will get all the credit as the One mighty in everything, forever and ever. Amen!</w:t>
+              <w:t>The world is about to have its season finale, so don't take anything for granted. Stay alert and pray. Most importantly, love each other like your life depends on it. Love pretty much fixes everything. If someone's hungry, be quick to get them a burger. If they need a place to crash, be quick to let them crash at your place. And do it with a smile. God gave you all sorts of cool stuff, so share it around so everyone gets in on it! If you're good with words, use them to say what God would say. If you're good at helping, then help with all your heart. That way, everyone will see how awesome God is, and Jesus will get all the credit as the One mighty in everything, forever and ever. Amen!</w:t>
             </w:r>
           </w:p>
         </w:tc>
@@ -2888,7 +2888,7 @@
               <w:rPr>
                 <w:sz w:val="18"/>
               </w:rPr>
-              <w:t>When life gets super hard, don't panic and think God ghosted you. Instead, be stoked that you're getting a taste of what Jesus went through. This is like a spiritual transformation, and something amazing is right around the corner.</w:t>
+              <w:t>Friends, when life gets super hard, don't panic and think God ghosted you. Instead, be stoked that you're getting a taste of what Jesus went through. This is a spiritual refining process, and glory is right around the corner.</w:t>
             </w:r>
           </w:p>
         </w:tc>
@@ -3231,7 +3231,7 @@
               <w:rPr>
                 <w:sz w:val="18"/>
               </w:rPr>
-              <w:t>Hey, to all the leaders out there, listen up. I’ve been there, done that, and got the t-shirt when it comes to leading and seeing both the rough times and the awesome glory of Christ. So here’s the deal: take care of God{A}s crew with all the diligence of a shepherd. Don’t do it because you have to, do it because you want to make God proud. Don’t be all about what you can get out of it — do it because you genuinely want to. Don’t be a bossy know-it-all, but show them how it’s done with some class.</w:t>
+              <w:t>Hey, to all the leaders out there, listen up. I’ve been there, done that, and got the t-shirt when it comes to leading and seeing both the rough times and the awesome glory of Christ. So here’s the deal: take care of God's crew with all the diligence of a shepherd. Don’t do it because you have to, do it because you want to make God proud. Don’t be all about what you can get out of it — do it because you genuinely want to. Don’t be a bossy know-it-all, but gently show them the way.</w:t>
             </w:r>
           </w:p>
         </w:tc>
@@ -3302,7 +3302,7 @@
               <w:rPr>
                 <w:sz w:val="18"/>
               </w:rPr>
-              <w:t>When God, the best shepherd of all, shows up to rule, he's gonna see you've been a real one and give you a major shout-out. And for all you younger guys, you gotta follow your leaders. But for real, everyone — leaders and followers — just stay down to earth with each other. God's done with the proud, but he loves people who stay humble and real.</w:t>
+              <w:t>When God, the best shepherd of all, shows up to rule, he'll see you've done it right and give you a major shout-out. And for all you younger guys, you gotta follow your leaders. But for real, everyone — leaders and followers — just stay down to earth with each other. God's done with the proud, but he loves people who stay humble and real.</w:t>
             </w:r>
           </w:p>
         </w:tc>
@@ -3507,7 +3507,7 @@
               <w:rPr>
                 <w:sz w:val="18"/>
               </w:rPr>
-              <w:t>Stay sharp and keep your eyes open. The Devil is like a lion waiting to pounce, and he’d love to catch you sleeping. So get your guard up. You’re not the only one going through it. Christians everywhere are in the same boat. So hold on tight to what you believe. This whole suffering thing won’t last forever. Pretty soon, this awesome God, who has epic, eternal, glorious plans for you in Christ, is gonna put you back together and get you on your feet for good. He’s the one who gets the final say, for real.</w:t>
+              <w:t>Stay sharp and keep your eyes open. The Devil is poised to pounce, and he'd love to catch you napping. So get your guard up. You’re not the only one going through it. Christians everywhere are in the same boat. So hold on tight to what you believe. This whole suffering thing won’t last forever. Pretty soon, this generous God, who has epic, eternal, glorious plans for you in Christ, is gonna put you back together and get you on your feet for good. He’s the one who gets the final say, for real.</w:t>
             </w:r>
           </w:p>
         </w:tc>
@@ -3720,7 +3720,7 @@
               <w:rPr>
                 <w:sz w:val="18"/>
               </w:rPr>
-              <w:t>The church crew in exile here with me — not forgotten by God for a moment — send their love. Mark, who’s like a son to me, says what’s up. Give everyone a big hug. Peace out to all of you who are on Team Christ.</w:t>
+              <w:t>The church crew in exile here with me — not forgotten by God for a moment — send their love. Mark, who’s like a son to me, says what’s up. Give everyone a big holy hug. Peace out to all of you who are on Team Christ.</w:t>
             </w:r>
           </w:p>
         </w:tc>

</xml_diff>